<commit_message>
Add analytics dashboard; open only active plan versions
</commit_message>
<xml_diff>
--- a/assets/help/PPMS_User_Manual.docx
+++ b/assets/help/PPMS_User_Manual.docx
@@ -60,7 +60,7 @@
         </w:rPr>
         <w:t>Modules: KD1 · F200-KD2 · F100-KD2</w:t>
         <w:br/>
-        <w:t>Edition: 29 September 2026</w:t>
+        <w:t>Edition: 30 September 2026</w:t>
       </w:r>
     </w:p>
     <w:p>
@@ -2017,7 +2017,7 @@
     </w:tbl>
     <w:p>
       <w:r>
-        <w:t>Charts that summarise the filtered plan: status breakdown, cumulative planned vs actual completion, completion by vehicle type, process step completion and the station bottleneck chart (average delay per station).</w:t>
+        <w:t>Charts that summarise the filtered plan, in three rows. Progress over time: Cumulative Progress, Weekly Throughput (planned vs completed per week with the overdue backlog) and Status Breakdown. Units &amp; delivery: Unit Progress Ranking (% complete vs expected by today) and Planned vs Expected Finish per unit. Bottlenecks &amp; issues: Station Bottleneck and Issues Trend (opened vs resolved, time to resolve). Each chart shows a one-line insight worked out from the data. F100-KD2 shows its own completion charts.</w:t>
       </w:r>
     </w:p>
     <w:p>
@@ -2110,7 +2110,7 @@
         <w:t xml:space="preserve">2.  </w:t>
       </w:r>
       <w:r>
-        <w:t>Hover any chart for exact values.</w:t>
+        <w:t>Use the small buttons on each chart to change its range, grouping (unit, battalion, vehicle) or view — your choice is remembered.</w:t>
       </w:r>
     </w:p>
     <w:p>
@@ -2126,9 +2126,68 @@
         <w:t xml:space="preserve">3.  </w:t>
       </w:r>
       <w:r>
-        <w:t>Use the expand icon on a chart to view it larger.</w:t>
-      </w:r>
-    </w:p>
+        <w:t>Read the insight line under each chart title for the key takeaway; hover the chart for exact values.</w:t>
+      </w:r>
+    </w:p>
+    <w:p>
+      <w:pPr>
+        <w:spacing w:after="60"/>
+        <w:ind w:left="510" w:hanging="340"/>
+      </w:pPr>
+      <w:r>
+        <w:rPr>
+          <w:b/>
+          <w:color w:val="1E3A8A"/>
+        </w:rPr>
+        <w:t xml:space="preserve">4.  </w:t>
+      </w:r>
+      <w:r>
+        <w:t>Use the expand icon to open a chart full screen — the insight is shown in full there.</w:t>
+      </w:r>
+    </w:p>
+    <w:p/>
+    <w:tbl>
+      <w:tblPr>
+        <w:tblW w:type="auto" w:w="0"/>
+        <w:tblLook w:firstColumn="1" w:firstRow="1" w:lastColumn="0" w:lastRow="0" w:noHBand="0" w:noVBand="1" w:val="04A0"/>
+      </w:tblPr>
+      <w:tblGrid>
+        <w:gridCol w:w="9638"/>
+      </w:tblGrid>
+      <w:tr>
+        <w:tc>
+          <w:tcPr>
+            <w:tcW w:type="dxa" w:w="9638"/>
+            <w:shd w:val="clear" w:color="auto" w:fill="FEF3C7"/>
+          </w:tcPr>
+          <w:p>
+            <w:r>
+              <w:rPr>
+                <w:b/>
+                <w:sz w:val="20"/>
+              </w:rPr>
+              <w:t>Tips</w:t>
+            </w:r>
+          </w:p>
+          <w:p>
+            <w:r>
+              <w:rPr>
+                <w:sz w:val="20"/>
+              </w:rPr>
+              <w:t>•  All charts follow the filter bar except Issues Trend, which covers the whole module.</w:t>
+            </w:r>
+          </w:p>
+          <w:p>
+            <w:r>
+              <w:rPr>
+                <w:sz w:val="20"/>
+              </w:rPr>
+              <w:t>•  Expected finish = planned finish plus the worst delay in that unit, in working days (Fridays excluded) — the same rule as the Executive Summary delivery card.</w:t>
+            </w:r>
+          </w:p>
+        </w:tc>
+      </w:tr>
+    </w:tbl>
     <w:p/>
     <w:p>
       <w:r>

</xml_diff>

<commit_message>
Hide or delete a process from the plan (Gantt → Edit → Reorder route → ⋯ menu)
</commit_message>
<xml_diff>
--- a/assets/help/PPMS_User_Manual.docx
+++ b/assets/help/PPMS_User_Manual.docx
@@ -2622,7 +2622,7 @@
         <w:t xml:space="preserve">5.  </w:t>
       </w:r>
       <w:r>
-        <w:t>Use Undo / Redo (arrows on the right) to reverse a change.</w:t>
+        <w:t>In Reorder route (Process view), each process has a ⋯ menu: Hide from plan keeps its blocks but removes it from the Gantt, VPX, Plan Table, summary and charts; Show in plan brings it back. Delete from plan permanently deletes its blocks in this plan version and removes the process from it; Restore to plan brings the empty process back.</w:t>
       </w:r>
     </w:p>
     <w:p>
@@ -2638,7 +2638,7 @@
         <w:t xml:space="preserve">6.  </w:t>
       </w:r>
       <w:r>
-        <w:t>The gear icon opens Options — Saturdays and No-work Days.</w:t>
+        <w:t>Use Undo / Redo (arrows on the right) to reverse a change.</w:t>
       </w:r>
     </w:p>
     <w:p>
@@ -2652,6 +2652,22 @@
           <w:color w:val="1E3A8A"/>
         </w:rPr>
         <w:t xml:space="preserve">7.  </w:t>
+      </w:r>
+      <w:r>
+        <w:t>The gear icon opens Options — Saturdays and No-work Days.</w:t>
+      </w:r>
+    </w:p>
+    <w:p>
+      <w:pPr>
+        <w:spacing w:after="60"/>
+        <w:ind w:left="510" w:hanging="340"/>
+      </w:pPr>
+      <w:r>
+        <w:rPr>
+          <w:b/>
+          <w:color w:val="1E3A8A"/>
+        </w:rPr>
+        <w:t xml:space="preserve">8.  </w:t>
       </w:r>
       <w:r>
         <w:t>Press Done to leave edit mode.</w:t>
@@ -2695,6 +2711,14 @@
                 <w:sz w:val="20"/>
               </w:rPr>
               <w:t>•  Moves skip no-work days.</w:t>
+            </w:r>
+          </w:p>
+          <w:p>
+            <w:r>
+              <w:rPr>
+                <w:sz w:val="20"/>
+              </w:rPr>
+              <w:t>•  Hidden and deleted processes appear greyed only in Reorder route mode. Hiding or deleting never changes the process catalog or other plan versions.</w:t>
             </w:r>
           </w:p>
         </w:tc>

</xml_diff>